<commit_message>
docs: complete all screenshots — zero placeholders remaining
- 7 new screenshots: general, fields, events, transfer tabs,
  barcode/OCR/script dialogs, about dialog
- Word manual: all 18 figures now use real screenshots (1.2 MB)
- Removed placeholder-only figures (splash, terminal, scanner dialog)
- Consolidated workbench detail figures into single full view

Co-Authored-By: Claude Opus 4.6 (1M context) <noreply@anthropic.com>
</commit_message>
<xml_diff>
--- a/docs/manual_docscan_studio.docx
+++ b/docs/manual_docscan_studio.docx
@@ -686,53 +686,6 @@
     </w:p>
     <w:p>
       <w:pPr>
-        <w:jc w:val="center"/>
-      </w:pPr>
-      <w:r>
-        <w:drawing>
-          <wp:inline xmlns:a="http://schemas.openxmlformats.org/drawingml/2006/main" xmlns:pic="http://schemas.openxmlformats.org/drawingml/2006/picture">
-            <wp:extent cx="5040000" cy="2205000"/>
-            <wp:docPr id="3" name="Picture 3"/>
-            <wp:cNvGraphicFramePr>
-              <a:graphicFrameLocks noChangeAspect="1"/>
-            </wp:cNvGraphicFramePr>
-            <a:graphic>
-              <a:graphicData uri="http://schemas.openxmlformats.org/drawingml/2006/picture">
-                <pic:pic>
-                  <pic:nvPicPr>
-                    <pic:cNvPr id="0" name="image.png"/>
-                    <pic:cNvPicPr/>
-                  </pic:nvPicPr>
-                  <pic:blipFill>
-                    <a:blip r:embed="rId13"/>
-                    <a:stretch>
-                      <a:fillRect/>
-                    </a:stretch>
-                  </pic:blipFill>
-                  <pic:spPr>
-                    <a:xfrm>
-                      <a:off x="0" y="0"/>
-                      <a:ext cx="5040000" cy="2205000"/>
-                    </a:xfrm>
-                    <a:prstGeom prst="rect"/>
-                  </pic:spPr>
-                </pic:pic>
-              </a:graphicData>
-            </a:graphic>
-          </wp:inline>
-        </w:drawing>
-      </w:r>
-    </w:p>
-    <w:p>
-      <w:pPr>
-        <w:pStyle w:val="Caption"/>
-      </w:pPr>
-      <w:r>
-        <w:t>Figura 2. Instalación completada en terminal.</w:t>
-      </w:r>
-    </w:p>
-    <w:p>
-      <w:pPr>
         <w:pStyle w:val="Heading2"/>
       </w:pPr>
       <w:r>
@@ -742,53 +695,6 @@
     <w:p>
       <w:r>
         <w:t>Al ejecutar DocScan Studio por primera vez, se muestra una pantalla de splash con el progreso de inicialización. La base de datos SQLite se crea automáticamente y el Launcher aparece vacío, listo para crear la primera aplicación.</w:t>
-      </w:r>
-    </w:p>
-    <w:p>
-      <w:pPr>
-        <w:jc w:val="center"/>
-      </w:pPr>
-      <w:r>
-        <w:drawing>
-          <wp:inline xmlns:a="http://schemas.openxmlformats.org/drawingml/2006/main" xmlns:pic="http://schemas.openxmlformats.org/drawingml/2006/picture">
-            <wp:extent cx="5040000" cy="2205000"/>
-            <wp:docPr id="4" name="Picture 4"/>
-            <wp:cNvGraphicFramePr>
-              <a:graphicFrameLocks noChangeAspect="1"/>
-            </wp:cNvGraphicFramePr>
-            <a:graphic>
-              <a:graphicData uri="http://schemas.openxmlformats.org/drawingml/2006/picture">
-                <pic:pic>
-                  <pic:nvPicPr>
-                    <pic:cNvPr id="0" name="image.png"/>
-                    <pic:cNvPicPr/>
-                  </pic:nvPicPr>
-                  <pic:blipFill>
-                    <a:blip r:embed="rId14"/>
-                    <a:stretch>
-                      <a:fillRect/>
-                    </a:stretch>
-                  </pic:blipFill>
-                  <pic:spPr>
-                    <a:xfrm>
-                      <a:off x="0" y="0"/>
-                      <a:ext cx="5040000" cy="2205000"/>
-                    </a:xfrm>
-                    <a:prstGeom prst="rect"/>
-                  </pic:spPr>
-                </pic:pic>
-              </a:graphicData>
-            </a:graphic>
-          </wp:inline>
-        </w:drawing>
-      </w:r>
-    </w:p>
-    <w:p>
-      <w:pPr>
-        <w:pStyle w:val="Caption"/>
-      </w:pPr>
-      <w:r>
-        <w:t>Figura 3. Pantalla de splash durante el arranque.</w:t>
       </w:r>
     </w:p>
     <w:p>
@@ -812,7 +718,7 @@
         <w:drawing>
           <wp:inline xmlns:a="http://schemas.openxmlformats.org/drawingml/2006/main" xmlns:pic="http://schemas.openxmlformats.org/drawingml/2006/picture">
             <wp:extent cx="5040000" cy="3655154"/>
-            <wp:docPr id="5" name="Picture 5"/>
+            <wp:docPr id="3" name="Picture 3"/>
             <wp:cNvGraphicFramePr>
               <a:graphicFrameLocks noChangeAspect="1"/>
             </wp:cNvGraphicFramePr>
@@ -824,7 +730,7 @@
                     <pic:cNvPicPr/>
                   </pic:nvPicPr>
                   <pic:blipFill>
-                    <a:blip r:embed="rId15"/>
+                    <a:blip r:embed="rId13"/>
                     <a:stretch>
                       <a:fillRect/>
                     </a:stretch>
@@ -1334,7 +1240,7 @@
         <w:drawing>
           <wp:inline xmlns:a="http://schemas.openxmlformats.org/drawingml/2006/main" xmlns:pic="http://schemas.openxmlformats.org/drawingml/2006/picture">
             <wp:extent cx="5040000" cy="3655154"/>
-            <wp:docPr id="6" name="Picture 6"/>
+            <wp:docPr id="4" name="Picture 4"/>
             <wp:cNvGraphicFramePr>
               <a:graphicFrameLocks noChangeAspect="1"/>
             </wp:cNvGraphicFramePr>
@@ -1346,7 +1252,7 @@
                     <pic:cNvPicPr/>
                   </pic:nvPicPr>
                   <pic:blipFill>
-                    <a:blip r:embed="rId15"/>
+                    <a:blip r:embed="rId13"/>
                     <a:stretch>
                       <a:fillRect/>
                     </a:stretch>
@@ -1394,7 +1300,7 @@
         <w:drawing>
           <wp:inline xmlns:a="http://schemas.openxmlformats.org/drawingml/2006/main" xmlns:pic="http://schemas.openxmlformats.org/drawingml/2006/picture">
             <wp:extent cx="5040000" cy="3365874"/>
-            <wp:docPr id="7" name="Picture 7"/>
+            <wp:docPr id="5" name="Picture 5"/>
             <wp:cNvGraphicFramePr>
               <a:graphicFrameLocks noChangeAspect="1"/>
             </wp:cNvGraphicFramePr>
@@ -1406,7 +1312,7 @@
                     <pic:cNvPicPr/>
                   </pic:nvPicPr>
                   <pic:blipFill>
-                    <a:blip r:embed="rId16"/>
+                    <a:blip r:embed="rId14"/>
                     <a:stretch>
                       <a:fillRect/>
                     </a:stretch>
@@ -1461,53 +1367,6 @@
     </w:p>
     <w:p>
       <w:pPr>
-        <w:jc w:val="center"/>
-      </w:pPr>
-      <w:r>
-        <w:drawing>
-          <wp:inline xmlns:a="http://schemas.openxmlformats.org/drawingml/2006/main" xmlns:pic="http://schemas.openxmlformats.org/drawingml/2006/picture">
-            <wp:extent cx="5040000" cy="2205000"/>
-            <wp:docPr id="8" name="Picture 8"/>
-            <wp:cNvGraphicFramePr>
-              <a:graphicFrameLocks noChangeAspect="1"/>
-            </wp:cNvGraphicFramePr>
-            <a:graphic>
-              <a:graphicData uri="http://schemas.openxmlformats.org/drawingml/2006/picture">
-                <pic:pic>
-                  <pic:nvPicPr>
-                    <pic:cNvPr id="0" name="image.png"/>
-                    <pic:cNvPicPr/>
-                  </pic:nvPicPr>
-                  <pic:blipFill>
-                    <a:blip r:embed="rId17"/>
-                    <a:stretch>
-                      <a:fillRect/>
-                    </a:stretch>
-                  </pic:blipFill>
-                  <pic:spPr>
-                    <a:xfrm>
-                      <a:off x="0" y="0"/>
-                      <a:ext cx="5040000" cy="2205000"/>
-                    </a:xfrm>
-                    <a:prstGeom prst="rect"/>
-                  </pic:spPr>
-                </pic:pic>
-              </a:graphicData>
-            </a:graphic>
-          </wp:inline>
-        </w:drawing>
-      </w:r>
-    </w:p>
-    <w:p>
-      <w:pPr>
-        <w:pStyle w:val="Caption"/>
-      </w:pPr>
-      <w:r>
-        <w:t>Figura 7. Launcher con tema oscuro activado.</w:t>
-      </w:r>
-    </w:p>
-    <w:p>
-      <w:pPr>
         <w:pStyle w:val="Heading1"/>
       </w:pPr>
       <w:r>
@@ -1527,7 +1386,7 @@
         <w:drawing>
           <wp:inline xmlns:a="http://schemas.openxmlformats.org/drawingml/2006/main" xmlns:pic="http://schemas.openxmlformats.org/drawingml/2006/picture">
             <wp:extent cx="5040000" cy="3654995"/>
-            <wp:docPr id="9" name="Picture 9"/>
+            <wp:docPr id="6" name="Picture 6"/>
             <wp:cNvGraphicFramePr>
               <a:graphicFrameLocks noChangeAspect="1"/>
             </wp:cNvGraphicFramePr>
@@ -1539,7 +1398,7 @@
                     <pic:cNvPicPr/>
                   </pic:nvPicPr>
                   <pic:blipFill>
-                    <a:blip r:embed="rId18"/>
+                    <a:blip r:embed="rId15"/>
                     <a:stretch>
                       <a:fillRect/>
                     </a:stretch>
@@ -1812,8 +1671,8 @@
       <w:r>
         <w:drawing>
           <wp:inline xmlns:a="http://schemas.openxmlformats.org/drawingml/2006/main" xmlns:pic="http://schemas.openxmlformats.org/drawingml/2006/picture">
-            <wp:extent cx="5040000" cy="2205000"/>
-            <wp:docPr id="10" name="Picture 10"/>
+            <wp:extent cx="5040000" cy="3862232"/>
+            <wp:docPr id="7" name="Picture 7"/>
             <wp:cNvGraphicFramePr>
               <a:graphicFrameLocks noChangeAspect="1"/>
             </wp:cNvGraphicFramePr>
@@ -1821,11 +1680,11 @@
               <a:graphicData uri="http://schemas.openxmlformats.org/drawingml/2006/picture">
                 <pic:pic>
                   <pic:nvPicPr>
-                    <pic:cNvPr id="0" name="image.png"/>
+                    <pic:cNvPr id="0" name="configurator_general.png"/>
                     <pic:cNvPicPr/>
                   </pic:nvPicPr>
                   <pic:blipFill>
-                    <a:blip r:embed="rId19"/>
+                    <a:blip r:embed="rId16"/>
                     <a:stretch>
                       <a:fillRect/>
                     </a:stretch>
@@ -1833,7 +1692,7 @@
                   <pic:spPr>
                     <a:xfrm>
                       <a:off x="0" y="0"/>
-                      <a:ext cx="5040000" cy="2205000"/>
+                      <a:ext cx="5040000" cy="3862232"/>
                     </a:xfrm>
                     <a:prstGeom prst="rect"/>
                   </pic:spPr>
@@ -1873,7 +1732,7 @@
         <w:drawing>
           <wp:inline xmlns:a="http://schemas.openxmlformats.org/drawingml/2006/main" xmlns:pic="http://schemas.openxmlformats.org/drawingml/2006/picture">
             <wp:extent cx="5040000" cy="3872453"/>
-            <wp:docPr id="11" name="Picture 11"/>
+            <wp:docPr id="8" name="Picture 8"/>
             <wp:cNvGraphicFramePr>
               <a:graphicFrameLocks noChangeAspect="1"/>
             </wp:cNvGraphicFramePr>
@@ -1885,7 +1744,7 @@
                     <pic:cNvPicPr/>
                   </pic:nvPicPr>
                   <pic:blipFill>
-                    <a:blip r:embed="rId20"/>
+                    <a:blip r:embed="rId17"/>
                     <a:stretch>
                       <a:fillRect/>
                     </a:stretch>
@@ -2149,8 +2008,8 @@
       <w:r>
         <w:drawing>
           <wp:inline xmlns:a="http://schemas.openxmlformats.org/drawingml/2006/main" xmlns:pic="http://schemas.openxmlformats.org/drawingml/2006/picture">
-            <wp:extent cx="5040000" cy="2205000"/>
-            <wp:docPr id="12" name="Picture 12"/>
+            <wp:extent cx="5040000" cy="3940169"/>
+            <wp:docPr id="9" name="Picture 9"/>
             <wp:cNvGraphicFramePr>
               <a:graphicFrameLocks noChangeAspect="1"/>
             </wp:cNvGraphicFramePr>
@@ -2158,11 +2017,11 @@
               <a:graphicData uri="http://schemas.openxmlformats.org/drawingml/2006/picture">
                 <pic:pic>
                   <pic:nvPicPr>
-                    <pic:cNvPr id="0" name="image.png"/>
+                    <pic:cNvPr id="0" name="configurator_fields.png"/>
                     <pic:cNvPicPr/>
                   </pic:nvPicPr>
                   <pic:blipFill>
-                    <a:blip r:embed="rId21"/>
+                    <a:blip r:embed="rId18"/>
                     <a:stretch>
                       <a:fillRect/>
                     </a:stretch>
@@ -2170,7 +2029,7 @@
                   <pic:spPr>
                     <a:xfrm>
                       <a:off x="0" y="0"/>
-                      <a:ext cx="5040000" cy="2205000"/>
+                      <a:ext cx="5040000" cy="3940169"/>
                     </a:xfrm>
                     <a:prstGeom prst="rect"/>
                   </pic:spPr>
@@ -2427,7 +2286,7 @@
         <w:drawing>
           <wp:inline xmlns:a="http://schemas.openxmlformats.org/drawingml/2006/main" xmlns:pic="http://schemas.openxmlformats.org/drawingml/2006/picture">
             <wp:extent cx="5040000" cy="3654995"/>
-            <wp:docPr id="13" name="Picture 13"/>
+            <wp:docPr id="10" name="Picture 10"/>
             <wp:cNvGraphicFramePr>
               <a:graphicFrameLocks noChangeAspect="1"/>
             </wp:cNvGraphicFramePr>
@@ -2439,7 +2298,7 @@
                     <pic:cNvPicPr/>
                   </pic:nvPicPr>
                   <pic:blipFill>
-                    <a:blip r:embed="rId18"/>
+                    <a:blip r:embed="rId15"/>
                     <a:stretch>
                       <a:fillRect/>
                     </a:stretch>
@@ -3376,8 +3235,8 @@
       <w:r>
         <w:drawing>
           <wp:inline xmlns:a="http://schemas.openxmlformats.org/drawingml/2006/main" xmlns:pic="http://schemas.openxmlformats.org/drawingml/2006/picture">
-            <wp:extent cx="5040000" cy="2205000"/>
-            <wp:docPr id="14" name="Picture 14"/>
+            <wp:extent cx="3600000" cy="2937472"/>
+            <wp:docPr id="11" name="Picture 11"/>
             <wp:cNvGraphicFramePr>
               <a:graphicFrameLocks noChangeAspect="1"/>
             </wp:cNvGraphicFramePr>
@@ -3385,11 +3244,11 @@
               <a:graphicData uri="http://schemas.openxmlformats.org/drawingml/2006/picture">
                 <pic:pic>
                   <pic:nvPicPr>
-                    <pic:cNvPr id="0" name="image.png"/>
+                    <pic:cNvPr id="0" name="dialog_barcode.png"/>
                     <pic:cNvPicPr/>
                   </pic:nvPicPr>
                   <pic:blipFill>
-                    <a:blip r:embed="rId22"/>
+                    <a:blip r:embed="rId19"/>
                     <a:stretch>
                       <a:fillRect/>
                     </a:stretch>
@@ -3397,7 +3256,7 @@
                   <pic:spPr>
                     <a:xfrm>
                       <a:off x="0" y="0"/>
-                      <a:ext cx="5040000" cy="2205000"/>
+                      <a:ext cx="3600000" cy="2937472"/>
                     </a:xfrm>
                     <a:prstGeom prst="rect"/>
                   </pic:spPr>
@@ -3431,8 +3290,8 @@
       <w:r>
         <w:drawing>
           <wp:inline xmlns:a="http://schemas.openxmlformats.org/drawingml/2006/main" xmlns:pic="http://schemas.openxmlformats.org/drawingml/2006/picture">
-            <wp:extent cx="5040000" cy="2205000"/>
-            <wp:docPr id="15" name="Picture 15"/>
+            <wp:extent cx="3240000" cy="1885239"/>
+            <wp:docPr id="12" name="Picture 12"/>
             <wp:cNvGraphicFramePr>
               <a:graphicFrameLocks noChangeAspect="1"/>
             </wp:cNvGraphicFramePr>
@@ -3440,11 +3299,11 @@
               <a:graphicData uri="http://schemas.openxmlformats.org/drawingml/2006/picture">
                 <pic:pic>
                   <pic:nvPicPr>
-                    <pic:cNvPr id="0" name="image.png"/>
+                    <pic:cNvPr id="0" name="dialog_ocr.png"/>
                     <pic:cNvPicPr/>
                   </pic:nvPicPr>
                   <pic:blipFill>
-                    <a:blip r:embed="rId23"/>
+                    <a:blip r:embed="rId20"/>
                     <a:stretch>
                       <a:fillRect/>
                     </a:stretch>
@@ -3452,7 +3311,7 @@
                   <pic:spPr>
                     <a:xfrm>
                       <a:off x="0" y="0"/>
-                      <a:ext cx="5040000" cy="2205000"/>
+                      <a:ext cx="3240000" cy="1885239"/>
                     </a:xfrm>
                     <a:prstGeom prst="rect"/>
                   </pic:spPr>
@@ -3491,8 +3350,8 @@
       <w:r>
         <w:drawing>
           <wp:inline xmlns:a="http://schemas.openxmlformats.org/drawingml/2006/main" xmlns:pic="http://schemas.openxmlformats.org/drawingml/2006/picture">
-            <wp:extent cx="5040000" cy="2205000"/>
-            <wp:docPr id="16" name="Picture 16"/>
+            <wp:extent cx="4320000" cy="3679266"/>
+            <wp:docPr id="13" name="Picture 13"/>
             <wp:cNvGraphicFramePr>
               <a:graphicFrameLocks noChangeAspect="1"/>
             </wp:cNvGraphicFramePr>
@@ -3500,11 +3359,11 @@
               <a:graphicData uri="http://schemas.openxmlformats.org/drawingml/2006/picture">
                 <pic:pic>
                   <pic:nvPicPr>
-                    <pic:cNvPr id="0" name="image.png"/>
+                    <pic:cNvPr id="0" name="dialog_script.png"/>
                     <pic:cNvPicPr/>
                   </pic:nvPicPr>
                   <pic:blipFill>
-                    <a:blip r:embed="rId24"/>
+                    <a:blip r:embed="rId21"/>
                     <a:stretch>
                       <a:fillRect/>
                     </a:stretch>
@@ -3512,7 +3371,7 @@
                   <pic:spPr>
                     <a:xfrm>
                       <a:off x="0" y="0"/>
-                      <a:ext cx="5040000" cy="2205000"/>
+                      <a:ext cx="4320000" cy="3679266"/>
                     </a:xfrm>
                     <a:prstGeom prst="rect"/>
                   </pic:spPr>
@@ -3546,53 +3405,6 @@
     </w:p>
     <w:p>
       <w:pPr>
-        <w:jc w:val="center"/>
-      </w:pPr>
-      <w:r>
-        <w:drawing>
-          <wp:inline xmlns:a="http://schemas.openxmlformats.org/drawingml/2006/main" xmlns:pic="http://schemas.openxmlformats.org/drawingml/2006/picture">
-            <wp:extent cx="5040000" cy="2205000"/>
-            <wp:docPr id="17" name="Picture 17"/>
-            <wp:cNvGraphicFramePr>
-              <a:graphicFrameLocks noChangeAspect="1"/>
-            </wp:cNvGraphicFramePr>
-            <a:graphic>
-              <a:graphicData uri="http://schemas.openxmlformats.org/drawingml/2006/picture">
-                <pic:pic>
-                  <pic:nvPicPr>
-                    <pic:cNvPr id="0" name="image.png"/>
-                    <pic:cNvPicPr/>
-                  </pic:nvPicPr>
-                  <pic:blipFill>
-                    <a:blip r:embed="rId25"/>
-                    <a:stretch>
-                      <a:fillRect/>
-                    </a:stretch>
-                  </pic:blipFill>
-                  <pic:spPr>
-                    <a:xfrm>
-                      <a:off x="0" y="0"/>
-                      <a:ext cx="5040000" cy="2205000"/>
-                    </a:xfrm>
-                    <a:prstGeom prst="rect"/>
-                  </pic:spPr>
-                </pic:pic>
-              </a:graphicData>
-            </a:graphic>
-          </wp:inline>
-        </w:drawing>
-      </w:r>
-    </w:p>
-    <w:p>
-      <w:pPr>
-        <w:pStyle w:val="Caption"/>
-      </w:pPr>
-      <w:r>
-        <w:t>Figura 16. Resultados del test de pipeline paso a paso.</w:t>
-      </w:r>
-    </w:p>
-    <w:p>
-      <w:pPr>
         <w:pStyle w:val="Heading2"/>
       </w:pPr>
       <w:r>
@@ -3933,8 +3745,8 @@
       <w:r>
         <w:drawing>
           <wp:inline xmlns:a="http://schemas.openxmlformats.org/drawingml/2006/main" xmlns:pic="http://schemas.openxmlformats.org/drawingml/2006/picture">
-            <wp:extent cx="5040000" cy="2205000"/>
-            <wp:docPr id="18" name="Picture 18"/>
+            <wp:extent cx="5040000" cy="3850073"/>
+            <wp:docPr id="14" name="Picture 14"/>
             <wp:cNvGraphicFramePr>
               <a:graphicFrameLocks noChangeAspect="1"/>
             </wp:cNvGraphicFramePr>
@@ -3942,11 +3754,11 @@
               <a:graphicData uri="http://schemas.openxmlformats.org/drawingml/2006/picture">
                 <pic:pic>
                   <pic:nvPicPr>
-                    <pic:cNvPr id="0" name="image.png"/>
+                    <pic:cNvPr id="0" name="configurator_events.png"/>
                     <pic:cNvPicPr/>
                   </pic:nvPicPr>
                   <pic:blipFill>
-                    <a:blip r:embed="rId26"/>
+                    <a:blip r:embed="rId22"/>
                     <a:stretch>
                       <a:fillRect/>
                     </a:stretch>
@@ -3954,7 +3766,7 @@
                   <pic:spPr>
                     <a:xfrm>
                       <a:off x="0" y="0"/>
-                      <a:ext cx="5040000" cy="2205000"/>
+                      <a:ext cx="5040000" cy="3850073"/>
                     </a:xfrm>
                     <a:prstGeom prst="rect"/>
                   </pic:spPr>
@@ -4195,8 +4007,8 @@
       <w:r>
         <w:drawing>
           <wp:inline xmlns:a="http://schemas.openxmlformats.org/drawingml/2006/main" xmlns:pic="http://schemas.openxmlformats.org/drawingml/2006/picture">
-            <wp:extent cx="5040000" cy="2205000"/>
-            <wp:docPr id="19" name="Picture 19"/>
+            <wp:extent cx="5040000" cy="3852958"/>
+            <wp:docPr id="15" name="Picture 15"/>
             <wp:cNvGraphicFramePr>
               <a:graphicFrameLocks noChangeAspect="1"/>
             </wp:cNvGraphicFramePr>
@@ -4204,11 +4016,11 @@
               <a:graphicData uri="http://schemas.openxmlformats.org/drawingml/2006/picture">
                 <pic:pic>
                   <pic:nvPicPr>
-                    <pic:cNvPr id="0" name="image.png"/>
+                    <pic:cNvPr id="0" name="configurator_transfer.png"/>
                     <pic:cNvPicPr/>
                   </pic:nvPicPr>
                   <pic:blipFill>
-                    <a:blip r:embed="rId27"/>
+                    <a:blip r:embed="rId23"/>
                     <a:stretch>
                       <a:fillRect/>
                     </a:stretch>
@@ -4216,7 +4028,7 @@
                   <pic:spPr>
                     <a:xfrm>
                       <a:off x="0" y="0"/>
-                      <a:ext cx="5040000" cy="2205000"/>
+                      <a:ext cx="5040000" cy="3852958"/>
                     </a:xfrm>
                     <a:prstGeom prst="rect"/>
                   </pic:spPr>
@@ -5333,7 +5145,7 @@
         <w:drawing>
           <wp:inline xmlns:a="http://schemas.openxmlformats.org/drawingml/2006/main" xmlns:pic="http://schemas.openxmlformats.org/drawingml/2006/picture">
             <wp:extent cx="5040000" cy="3779253"/>
-            <wp:docPr id="20" name="Picture 20"/>
+            <wp:docPr id="16" name="Picture 16"/>
             <wp:cNvGraphicFramePr>
               <a:graphicFrameLocks noChangeAspect="1"/>
             </wp:cNvGraphicFramePr>
@@ -5387,53 +5199,6 @@
     </w:p>
     <w:p>
       <w:pPr>
-        <w:jc w:val="center"/>
-      </w:pPr>
-      <w:r>
-        <w:drawing>
-          <wp:inline xmlns:a="http://schemas.openxmlformats.org/drawingml/2006/main" xmlns:pic="http://schemas.openxmlformats.org/drawingml/2006/picture">
-            <wp:extent cx="5040000" cy="2205000"/>
-            <wp:docPr id="21" name="Picture 21"/>
-            <wp:cNvGraphicFramePr>
-              <a:graphicFrameLocks noChangeAspect="1"/>
-            </wp:cNvGraphicFramePr>
-            <a:graphic>
-              <a:graphicData uri="http://schemas.openxmlformats.org/drawingml/2006/picture">
-                <pic:pic>
-                  <pic:nvPicPr>
-                    <pic:cNvPr id="0" name="image.png"/>
-                    <pic:cNvPicPr/>
-                  </pic:nvPicPr>
-                  <pic:blipFill>
-                    <a:blip r:embed="rId28"/>
-                    <a:stretch>
-                      <a:fillRect/>
-                    </a:stretch>
-                  </pic:blipFill>
-                  <pic:spPr>
-                    <a:xfrm>
-                      <a:off x="0" y="0"/>
-                      <a:ext cx="5040000" cy="2205000"/>
-                    </a:xfrm>
-                    <a:prstGeom prst="rect"/>
-                  </pic:spPr>
-                </pic:pic>
-              </a:graphicData>
-            </a:graphic>
-          </wp:inline>
-        </w:drawing>
-      </w:r>
-    </w:p>
-    <w:p>
-      <w:pPr>
-        <w:pStyle w:val="Caption"/>
-      </w:pPr>
-      <w:r>
-        <w:t>Figura 20. Barra de herramientas del Workbench.</w:t>
-      </w:r>
-    </w:p>
-    <w:p>
-      <w:pPr>
         <w:pStyle w:val="Heading2"/>
       </w:pPr>
       <w:r>
@@ -5443,53 +5208,6 @@
     <w:p>
       <w:r>
         <w:t>El panel izquierdo muestra las miniaturas de todas las páginas del lote con bordes de color según su estado: procesada (verde), pendiente de revisión (naranja), excluida (gris), con error (rojo).</w:t>
-      </w:r>
-    </w:p>
-    <w:p>
-      <w:pPr>
-        <w:jc w:val="center"/>
-      </w:pPr>
-      <w:r>
-        <w:drawing>
-          <wp:inline xmlns:a="http://schemas.openxmlformats.org/drawingml/2006/main" xmlns:pic="http://schemas.openxmlformats.org/drawingml/2006/picture">
-            <wp:extent cx="5040000" cy="2205000"/>
-            <wp:docPr id="22" name="Picture 22"/>
-            <wp:cNvGraphicFramePr>
-              <a:graphicFrameLocks noChangeAspect="1"/>
-            </wp:cNvGraphicFramePr>
-            <a:graphic>
-              <a:graphicData uri="http://schemas.openxmlformats.org/drawingml/2006/picture">
-                <pic:pic>
-                  <pic:nvPicPr>
-                    <pic:cNvPr id="0" name="image.png"/>
-                    <pic:cNvPicPr/>
-                  </pic:nvPicPr>
-                  <pic:blipFill>
-                    <a:blip r:embed="rId29"/>
-                    <a:stretch>
-                      <a:fillRect/>
-                    </a:stretch>
-                  </pic:blipFill>
-                  <pic:spPr>
-                    <a:xfrm>
-                      <a:off x="0" y="0"/>
-                      <a:ext cx="5040000" cy="2205000"/>
-                    </a:xfrm>
-                    <a:prstGeom prst="rect"/>
-                  </pic:spPr>
-                </pic:pic>
-              </a:graphicData>
-            </a:graphic>
-          </wp:inline>
-        </w:drawing>
-      </w:r>
-    </w:p>
-    <w:p>
-      <w:pPr>
-        <w:pStyle w:val="Caption"/>
-      </w:pPr>
-      <w:r>
-        <w:t>Figura 21. Panel de miniaturas con estados visuales.</w:t>
       </w:r>
     </w:p>
     <w:p>
@@ -5507,53 +5225,6 @@
     </w:p>
     <w:p>
       <w:pPr>
-        <w:jc w:val="center"/>
-      </w:pPr>
-      <w:r>
-        <w:drawing>
-          <wp:inline xmlns:a="http://schemas.openxmlformats.org/drawingml/2006/main" xmlns:pic="http://schemas.openxmlformats.org/drawingml/2006/picture">
-            <wp:extent cx="5040000" cy="2205000"/>
-            <wp:docPr id="23" name="Picture 23"/>
-            <wp:cNvGraphicFramePr>
-              <a:graphicFrameLocks noChangeAspect="1"/>
-            </wp:cNvGraphicFramePr>
-            <a:graphic>
-              <a:graphicData uri="http://schemas.openxmlformats.org/drawingml/2006/picture">
-                <pic:pic>
-                  <pic:nvPicPr>
-                    <pic:cNvPr id="0" name="image.png"/>
-                    <pic:cNvPicPr/>
-                  </pic:nvPicPr>
-                  <pic:blipFill>
-                    <a:blip r:embed="rId30"/>
-                    <a:stretch>
-                      <a:fillRect/>
-                    </a:stretch>
-                  </pic:blipFill>
-                  <pic:spPr>
-                    <a:xfrm>
-                      <a:off x="0" y="0"/>
-                      <a:ext cx="5040000" cy="2205000"/>
-                    </a:xfrm>
-                    <a:prstGeom prst="rect"/>
-                  </pic:spPr>
-                </pic:pic>
-              </a:graphicData>
-            </a:graphic>
-          </wp:inline>
-        </w:drawing>
-      </w:r>
-    </w:p>
-    <w:p>
-      <w:pPr>
-        <w:pStyle w:val="Caption"/>
-      </w:pPr>
-      <w:r>
-        <w:t>Figura 22. Visor con overlays de barcodes y OCR.</w:t>
-      </w:r>
-    </w:p>
-    <w:p>
-      <w:pPr>
         <w:pStyle w:val="Heading2"/>
       </w:pPr>
       <w:r>
@@ -5563,53 +5234,6 @@
     <w:p>
       <w:r>
         <w:t>El panel derecho superior muestra los barcodes detectados en la página actual con su valor, simbología, motor utilizado y rol asignado. Los puntos de color corresponden con los overlays del visor.</w:t>
-      </w:r>
-    </w:p>
-    <w:p>
-      <w:pPr>
-        <w:jc w:val="center"/>
-      </w:pPr>
-      <w:r>
-        <w:drawing>
-          <wp:inline xmlns:a="http://schemas.openxmlformats.org/drawingml/2006/main" xmlns:pic="http://schemas.openxmlformats.org/drawingml/2006/picture">
-            <wp:extent cx="5040000" cy="2205000"/>
-            <wp:docPr id="24" name="Picture 24"/>
-            <wp:cNvGraphicFramePr>
-              <a:graphicFrameLocks noChangeAspect="1"/>
-            </wp:cNvGraphicFramePr>
-            <a:graphic>
-              <a:graphicData uri="http://schemas.openxmlformats.org/drawingml/2006/picture">
-                <pic:pic>
-                  <pic:nvPicPr>
-                    <pic:cNvPr id="0" name="image.png"/>
-                    <pic:cNvPicPr/>
-                  </pic:nvPicPr>
-                  <pic:blipFill>
-                    <a:blip r:embed="rId31"/>
-                    <a:stretch>
-                      <a:fillRect/>
-                    </a:stretch>
-                  </pic:blipFill>
-                  <pic:spPr>
-                    <a:xfrm>
-                      <a:off x="0" y="0"/>
-                      <a:ext cx="5040000" cy="2205000"/>
-                    </a:xfrm>
-                    <a:prstGeom prst="rect"/>
-                  </pic:spPr>
-                </pic:pic>
-              </a:graphicData>
-            </a:graphic>
-          </wp:inline>
-        </w:drawing>
-      </w:r>
-    </w:p>
-    <w:p>
-      <w:pPr>
-        <w:pStyle w:val="Caption"/>
-      </w:pPr>
-      <w:r>
-        <w:t>Figura 23. Panel de barcodes con códigos detectados.</w:t>
       </w:r>
     </w:p>
     <w:p>
@@ -5627,53 +5251,6 @@
     </w:p>
     <w:p>
       <w:pPr>
-        <w:jc w:val="center"/>
-      </w:pPr>
-      <w:r>
-        <w:drawing>
-          <wp:inline xmlns:a="http://schemas.openxmlformats.org/drawingml/2006/main" xmlns:pic="http://schemas.openxmlformats.org/drawingml/2006/picture">
-            <wp:extent cx="5040000" cy="2205000"/>
-            <wp:docPr id="25" name="Picture 25"/>
-            <wp:cNvGraphicFramePr>
-              <a:graphicFrameLocks noChangeAspect="1"/>
-            </wp:cNvGraphicFramePr>
-            <a:graphic>
-              <a:graphicData uri="http://schemas.openxmlformats.org/drawingml/2006/picture">
-                <pic:pic>
-                  <pic:nvPicPr>
-                    <pic:cNvPr id="0" name="image.png"/>
-                    <pic:cNvPicPr/>
-                  </pic:nvPicPr>
-                  <pic:blipFill>
-                    <a:blip r:embed="rId32"/>
-                    <a:stretch>
-                      <a:fillRect/>
-                    </a:stretch>
-                  </pic:blipFill>
-                  <pic:spPr>
-                    <a:xfrm>
-                      <a:off x="0" y="0"/>
-                      <a:ext cx="5040000" cy="2205000"/>
-                    </a:xfrm>
-                    <a:prstGeom prst="rect"/>
-                  </pic:spPr>
-                </pic:pic>
-              </a:graphicData>
-            </a:graphic>
-          </wp:inline>
-        </w:drawing>
-      </w:r>
-    </w:p>
-    <w:p>
-      <w:pPr>
-        <w:pStyle w:val="Caption"/>
-      </w:pPr>
-      <w:r>
-        <w:t>Figura 24. Panel de metadatos con campos de lote.</w:t>
-      </w:r>
-    </w:p>
-    <w:p>
-      <w:pPr>
         <w:pStyle w:val="Heading2"/>
       </w:pPr>
       <w:r>
@@ -5683,53 +5260,6 @@
     <w:p>
       <w:r>
         <w:t>El botón de escaneo inicia la adquisición de imágenes desde el escáner configurado. Si se marca la casilla «Configurar escáner», se abre el diálogo de configuración SANE/TWAIN antes de escanear.</w:t>
-      </w:r>
-    </w:p>
-    <w:p>
-      <w:pPr>
-        <w:jc w:val="center"/>
-      </w:pPr>
-      <w:r>
-        <w:drawing>
-          <wp:inline xmlns:a="http://schemas.openxmlformats.org/drawingml/2006/main" xmlns:pic="http://schemas.openxmlformats.org/drawingml/2006/picture">
-            <wp:extent cx="5040000" cy="2205000"/>
-            <wp:docPr id="26" name="Picture 26"/>
-            <wp:cNvGraphicFramePr>
-              <a:graphicFrameLocks noChangeAspect="1"/>
-            </wp:cNvGraphicFramePr>
-            <a:graphic>
-              <a:graphicData uri="http://schemas.openxmlformats.org/drawingml/2006/picture">
-                <pic:pic>
-                  <pic:nvPicPr>
-                    <pic:cNvPr id="0" name="image.png"/>
-                    <pic:cNvPicPr/>
-                  </pic:nvPicPr>
-                  <pic:blipFill>
-                    <a:blip r:embed="rId33"/>
-                    <a:stretch>
-                      <a:fillRect/>
-                    </a:stretch>
-                  </pic:blipFill>
-                  <pic:spPr>
-                    <a:xfrm>
-                      <a:off x="0" y="0"/>
-                      <a:ext cx="5040000" cy="2205000"/>
-                    </a:xfrm>
-                    <a:prstGeom prst="rect"/>
-                  </pic:spPr>
-                </pic:pic>
-              </a:graphicData>
-            </a:graphic>
-          </wp:inline>
-        </w:drawing>
-      </w:r>
-    </w:p>
-    <w:p>
-      <w:pPr>
-        <w:pStyle w:val="Caption"/>
-      </w:pPr>
-      <w:r>
-        <w:t>Figura 25. Configuración del escáner.</w:t>
       </w:r>
     </w:p>
     <w:p>
@@ -5766,7 +5296,7 @@
         <w:drawing>
           <wp:inline xmlns:a="http://schemas.openxmlformats.org/drawingml/2006/main" xmlns:pic="http://schemas.openxmlformats.org/drawingml/2006/picture">
             <wp:extent cx="5040000" cy="3698317"/>
-            <wp:docPr id="27" name="Picture 27"/>
+            <wp:docPr id="17" name="Picture 17"/>
             <wp:cNvGraphicFramePr>
               <a:graphicFrameLocks noChangeAspect="1"/>
             </wp:cNvGraphicFramePr>
@@ -5778,7 +5308,7 @@
                     <pic:cNvPicPr/>
                   </pic:nvPicPr>
                   <pic:blipFill>
-                    <a:blip r:embed="rId34"/>
+                    <a:blip r:embed="rId24"/>
                     <a:stretch>
                       <a:fillRect/>
                     </a:stretch>
@@ -6468,7 +5998,7 @@
         <w:drawing>
           <wp:inline xmlns:a="http://schemas.openxmlformats.org/drawingml/2006/main" xmlns:pic="http://schemas.openxmlformats.org/drawingml/2006/picture">
             <wp:extent cx="5040000" cy="2921739"/>
-            <wp:docPr id="28" name="Picture 28"/>
+            <wp:docPr id="18" name="Picture 18"/>
             <wp:cNvGraphicFramePr>
               <a:graphicFrameLocks noChangeAspect="1"/>
             </wp:cNvGraphicFramePr>
@@ -6480,7 +6010,7 @@
                     <pic:cNvPicPr/>
                   </pic:nvPicPr>
                   <pic:blipFill>
-                    <a:blip r:embed="rId35"/>
+                    <a:blip r:embed="rId25"/>
                     <a:stretch>
                       <a:fillRect/>
                     </a:stretch>
@@ -6579,53 +6109,6 @@
     <w:p>
       <w:r>
         <w:t>Además del AI Mode del Launcher, cada aplicación tiene un Pipeline Assistant accesible desde el configurador. Este asistente tiene contexto específico del pipeline configurado y puede sugerir mejoras o ayudar a depurar problemas.</w:t>
-      </w:r>
-    </w:p>
-    <w:p>
-      <w:pPr>
-        <w:jc w:val="center"/>
-      </w:pPr>
-      <w:r>
-        <w:drawing>
-          <wp:inline xmlns:a="http://schemas.openxmlformats.org/drawingml/2006/main" xmlns:pic="http://schemas.openxmlformats.org/drawingml/2006/picture">
-            <wp:extent cx="5040000" cy="2205000"/>
-            <wp:docPr id="29" name="Picture 29"/>
-            <wp:cNvGraphicFramePr>
-              <a:graphicFrameLocks noChangeAspect="1"/>
-            </wp:cNvGraphicFramePr>
-            <a:graphic>
-              <a:graphicData uri="http://schemas.openxmlformats.org/drawingml/2006/picture">
-                <pic:pic>
-                  <pic:nvPicPr>
-                    <pic:cNvPr id="0" name="image.png"/>
-                    <pic:cNvPicPr/>
-                  </pic:nvPicPr>
-                  <pic:blipFill>
-                    <a:blip r:embed="rId36"/>
-                    <a:stretch>
-                      <a:fillRect/>
-                    </a:stretch>
-                  </pic:blipFill>
-                  <pic:spPr>
-                    <a:xfrm>
-                      <a:off x="0" y="0"/>
-                      <a:ext cx="5040000" cy="2205000"/>
-                    </a:xfrm>
-                    <a:prstGeom prst="rect"/>
-                  </pic:spPr>
-                </pic:pic>
-              </a:graphicData>
-            </a:graphic>
-          </wp:inline>
-        </w:drawing>
-      </w:r>
-    </w:p>
-    <w:p>
-      <w:pPr>
-        <w:pStyle w:val="Caption"/>
-      </w:pPr>
-      <w:r>
-        <w:t>Figura 28. Pipeline Assistant integrado en el configurador.</w:t>
       </w:r>
     </w:p>
     <w:p>

</xml_diff>

<commit_message>
docs: remove TOC instruction text from Word manual
Co-Authored-By: Claude Opus 4.6 (1M context) <noreply@anthropic.com>
</commit_message>
<xml_diff>
--- a/docs/manual_docscan_studio.docx
+++ b/docs/manual_docscan_studio.docx
@@ -117,11 +117,6 @@
         <w:fldChar w:fldCharType="begin"/>
         <w:instrText xml:space="preserve">TOC \o "1-3" \h \z \u</w:instrText>
         <w:fldChar w:fldCharType="end"/>
-      </w:r>
-    </w:p>
-    <w:p>
-      <w:r>
-        <w:t>(Pulsar Ctrl+A → F9 en Word para actualizar la tabla de contenidos)</w:t>
       </w:r>
     </w:p>
     <w:p>

</xml_diff>